<commit_message>
Updated AI section on skills
</commit_message>
<xml_diff>
--- a/Resume.docx
+++ b/Resume.docx
@@ -1342,6 +1342,40 @@
         </w:rPr>
         <w:t>.</w:t>
       </w:r>
+      <w:r>
+        <w:rPr>
+          <w:rFonts w:asciiTheme="majorHAnsi" w:hAnsiTheme="majorHAnsi"/>
+        </w:rPr>
+        <w:t xml:space="preserve"> Familiar with </w:t>
+      </w:r>
+      <w:r>
+        <w:rPr>
+          <w:rFonts w:asciiTheme="majorHAnsi" w:hAnsiTheme="majorHAnsi"/>
+          <w:b/>
+          <w:bCs/>
+        </w:rPr>
+        <w:t>Graphify</w:t>
+      </w:r>
+      <w:r>
+        <w:rPr>
+          <w:rFonts w:asciiTheme="majorHAnsi" w:hAnsiTheme="majorHAnsi"/>
+        </w:rPr>
+        <w:t xml:space="preserve"> and </w:t>
+      </w:r>
+      <w:r>
+        <w:rPr>
+          <w:rFonts w:asciiTheme="majorHAnsi" w:hAnsiTheme="majorHAnsi"/>
+          <w:b/>
+          <w:bCs/>
+        </w:rPr>
+        <w:t>llama.cpp</w:t>
+      </w:r>
+      <w:r>
+        <w:rPr>
+          <w:rFonts w:asciiTheme="majorHAnsi" w:hAnsiTheme="majorHAnsi"/>
+        </w:rPr>
+        <w:t>.</w:t>
+      </w:r>
     </w:p>
     <w:p>
       <w:pPr>
@@ -1458,7 +1492,7 @@
           <w:b/>
           <w:bCs/>
         </w:rPr>
-        <w:t>Orbit</w:t>
+        <w:t>Notion</w:t>
       </w:r>
       <w:r>
         <w:rPr>

</xml_diff>